<commit_message>
chore: docs/ aktualisieren — Dokumente geändert, veraltete Datei entfernt, Bilder ausgeschlossen
Co-Authored-By: Claude Opus 4.6 (1M context) <noreply@anthropic.com>
</commit_message>
<xml_diff>
--- a/docs/Projektbeschreibung.docx
+++ b/docs/Projektbeschreibung.docx
@@ -908,14 +908,7 @@
           <w:rFonts w:ascii="Nunito" w:hAnsi="Nunito"/>
           <w:color w:val="222222"/>
         </w:rPr>
-        <w:t xml:space="preserve"> Dialo</w:t>
-      </w:r>
-      <w:r>
-        <w:rPr>
-          <w:rFonts w:ascii="Nunito" w:hAnsi="Nunito"/>
-          <w:color w:val="222222"/>
-        </w:rPr>
-        <w:t>g</w:t>
+        <w:t xml:space="preserve"> Dialog</w:t>
       </w:r>
     </w:p>
     <w:p>
@@ -1076,21 +1069,7 @@
           <w:rFonts w:ascii="Nunito" w:hAnsi="Nunito"/>
           <w:color w:val="000000"/>
         </w:rPr>
-        <w:t xml:space="preserve"> Berlin Volunteers</w:t>
-      </w:r>
-      <w:r>
-        <w:rPr>
-          <w:rFonts w:ascii="Nunito" w:hAnsi="Nunito"/>
-          <w:color w:val="000000"/>
-        </w:rPr>
-        <w:t>,</w:t>
-      </w:r>
-      <w:r>
-        <w:rPr>
-          <w:rFonts w:ascii="Nunito" w:hAnsi="Nunito"/>
-          <w:color w:val="000000"/>
-        </w:rPr>
-        <w:t xml:space="preserve"> eine gemeinnützige Initiative in Berlin, die offene Räume für Begegnung, Austausch und gemeinsames Engagement schafft. Durch kulturelle, soziale und kreative Formate bringen wir Menschen unterschiedlicher Herkunft und Generationen zusammen. Unser Ziel ist es, nachbarschaftliche Verbindungen zu stärken, Integration zu fördern und eine lebendige, unterstützende Gemeinschaft im Bezirk aufzubauen.</w:t>
+        <w:t xml:space="preserve"> Berlin Volunteers, eine gemeinnützige Initiative in Berlin, die offene Räume für Begegnung, Austausch und gemeinsames Engagement schafft. Durch kulturelle, soziale und kreative Formate bringen wir Menschen unterschiedlicher Herkunft und Generationen zusammen. Unser Ziel ist es, nachbarschaftliche Verbindungen zu stärken, Integration zu fördern und eine lebendige, unterstützende Gemeinschaft im Bezirk aufzubauen.</w:t>
       </w:r>
       <w:r>
         <w:rPr>
@@ -1173,15 +1152,7 @@
           <w:szCs w:val="24"/>
         </w:rPr>
         <w:noBreakHyphen/>
-        <w:t>Lichtenberg und Rummelsburg.</w:t>
-      </w:r>
-      <w:r>
-        <w:rPr>
-          <w:rFonts w:ascii="Nunito" w:hAnsi="Nunito"/>
-          <w:sz w:val="24"/>
-          <w:szCs w:val="24"/>
-        </w:rPr>
-        <w:t xml:space="preserve"> </w:t>
+        <w:t xml:space="preserve">Lichtenberg und Rummelsburg. </w:t>
       </w:r>
     </w:p>
     <w:p>
@@ -1189,16 +1160,7 @@
         <w:pStyle w:val="berschrift3"/>
       </w:pPr>
       <w:r>
-        <w:t>W</w:t>
-      </w:r>
-      <w:r>
-        <w:t xml:space="preserve">er fördert </w:t>
-      </w:r>
-      <w:r>
-        <w:t>das Projekt</w:t>
-      </w:r>
-      <w:r>
-        <w:t>?</w:t>
+        <w:t>Wer fördert das Projekt?</w:t>
       </w:r>
     </w:p>
     <w:p>
@@ -1263,37 +1225,7 @@
           <w:rFonts w:ascii="Nunito" w:hAnsi="Nunito"/>
           <w:color w:val="1F1F1F"/>
         </w:rPr>
-        <w:t xml:space="preserve">Gemeinsam bereiten wir abwechslungsreiche Gerichte zu, essen zusammen und verbringen Zeit in entspannter </w:t>
-      </w:r>
-      <w:proofErr w:type="spellStart"/>
-      <w:r>
-        <w:rPr>
-          <w:rFonts w:ascii="Nunito" w:hAnsi="Nunito"/>
-          <w:color w:val="1F1F1F"/>
-        </w:rPr>
-        <w:t>Atmosphäre.</w:t>
-      </w:r>
-      <w:r>
-        <w:rPr>
-          <w:rFonts w:ascii="Nunito" w:hAnsi="Nunito"/>
-          <w:color w:val="1F1F1F"/>
-        </w:rPr>
-        <w:t xml:space="preserve"> </w:t>
-      </w:r>
-      <w:proofErr w:type="spellEnd"/>
-      <w:r>
-        <w:rPr>
-          <w:rFonts w:ascii="Nunito" w:hAnsi="Nunito"/>
-          <w:color w:val="1F1F1F"/>
-        </w:rPr>
-        <w:t>Die Workshops finden regelmäßig statt, sind offen für alle und kostenlos.</w:t>
-      </w:r>
-      <w:r>
-        <w:rPr>
-          <w:rFonts w:ascii="Nunito" w:hAnsi="Nunito"/>
-          <w:color w:val="1F1F1F"/>
-        </w:rPr>
-        <w:t xml:space="preserve"> </w:t>
+        <w:t xml:space="preserve">Gemeinsam bereiten wir abwechslungsreiche Gerichte zu, essen zusammen und verbringen Zeit in entspannter Atmosphäre. Die Workshops finden regelmäßig statt, sind offen für alle und kostenlos. </w:t>
       </w:r>
     </w:p>
     <w:p>
@@ -1561,16 +1493,7 @@
           <w:b w:val="0"/>
           <w:bCs w:val="0"/>
         </w:rPr>
-        <w:t>„</w:t>
-      </w:r>
-      <w:r>
-        <w:rPr>
-          <w:rStyle w:val="Fett"/>
-          <w:rFonts w:ascii="Nunito" w:hAnsi="Nunito"/>
-          <w:b w:val="0"/>
-          <w:bCs w:val="0"/>
-        </w:rPr>
-        <w:t>Gemeinsam Kochen – Gemeinsam Wachsen“</w:t>
+        <w:t>„Gemeinsam Kochen – Gemeinsam Wachsen“</w:t>
       </w:r>
     </w:p>
     <w:p>
@@ -1607,13 +1530,17 @@
           <w:b/>
           <w:bCs/>
         </w:rPr>
-        <w:t>Die Website dient in erster Linie als Informations- und Transparenzplattform. Sie ist ausdrücklich keine Verkaufsseite.</w:t>
-      </w:r>
-      <w:r>
-        <w:rPr>
-          <w:rFonts w:ascii="Nunito" w:hAnsi="Nunito"/>
-          <w:b/>
-          <w:bCs/>
+        <w:t xml:space="preserve">Die Website dient in erster Linie als Informations- und Transparenzplattform. Sie ist ausdrücklich keine Verkaufsseite. </w:t>
+      </w:r>
+      <w:r>
+        <w:rPr>
+          <w:rFonts w:ascii="Nunito" w:hAnsi="Nunito"/>
+        </w:rPr>
+        <w:t>Sie soll</w:t>
+      </w:r>
+      <w:r>
+        <w:rPr>
+          <w:rFonts w:ascii="Nunito" w:hAnsi="Nunito"/>
         </w:rPr>
         <w:t xml:space="preserve"> </w:t>
       </w:r>
@@ -1621,18 +1548,6 @@
         <w:rPr>
           <w:rFonts w:ascii="Nunito" w:hAnsi="Nunito"/>
         </w:rPr>
-        <w:t>Sie soll</w:t>
-      </w:r>
-      <w:r>
-        <w:rPr>
-          <w:rFonts w:ascii="Nunito" w:hAnsi="Nunito"/>
-        </w:rPr>
-        <w:t xml:space="preserve"> </w:t>
-      </w:r>
-      <w:r>
-        <w:rPr>
-          <w:rFonts w:ascii="Nunito" w:hAnsi="Nunito"/>
-        </w:rPr>
         <w:t>die Projektarbeit verständlich präsentieren, einen Überblick über Workshops und Aktivitäten bieten, die Dokumentation für Fördermittel gewährleisten</w:t>
       </w:r>
       <w:r>
@@ -1657,13 +1572,7 @@
         <w:rPr>
           <w:rFonts w:ascii="Nunito" w:hAnsi="Nunito"/>
         </w:rPr>
-        <w:t>der</w:t>
-      </w:r>
-      <w:r>
-        <w:rPr>
-          <w:rFonts w:ascii="Nunito" w:hAnsi="Nunito"/>
-        </w:rPr>
-        <w:t xml:space="preserve"> Initiative </w:t>
+        <w:t xml:space="preserve">der Initiative </w:t>
       </w:r>
       <w:proofErr w:type="spellStart"/>
       <w:r>
@@ -1990,25 +1899,7 @@
         <w:rPr>
           <w:rFonts w:ascii="Nunito" w:hAnsi="Nunito"/>
         </w:rPr>
-        <w:t xml:space="preserve"> </w:t>
-      </w:r>
-      <w:r>
-        <w:rPr>
-          <w:rFonts w:ascii="Nunito" w:hAnsi="Nunito"/>
-        </w:rPr>
-        <w:t>Berlin</w:t>
-      </w:r>
-      <w:r>
-        <w:rPr>
-          <w:rFonts w:ascii="Nunito" w:hAnsi="Nunito"/>
-        </w:rPr>
-        <w:t xml:space="preserve"> </w:t>
-      </w:r>
-      <w:r>
-        <w:rPr>
-          <w:rFonts w:ascii="Nunito" w:hAnsi="Nunito"/>
-        </w:rPr>
-        <w:t>Volunteers) wachsen kann.</w:t>
+        <w:t xml:space="preserve"> Berlin Volunteers) wachsen kann.</w:t>
       </w:r>
     </w:p>
     <w:p>
@@ -2043,19 +1934,7 @@
         <w:rPr>
           <w:rFonts w:ascii="Nunito" w:hAnsi="Nunito"/>
         </w:rPr>
-        <w:t>Familien</w:t>
-      </w:r>
-      <w:r>
-        <w:rPr>
-          <w:rFonts w:ascii="Nunito" w:hAnsi="Nunito"/>
-        </w:rPr>
-        <w:t>,</w:t>
-      </w:r>
-      <w:r>
-        <w:rPr>
-          <w:rFonts w:ascii="Nunito" w:hAnsi="Nunito"/>
-        </w:rPr>
-        <w:t xml:space="preserve"> </w:t>
+        <w:t xml:space="preserve">Familien, </w:t>
       </w:r>
       <w:r>
         <w:rPr>
@@ -2528,6 +2407,24 @@
           <w:rFonts w:ascii="Nunito" w:hAnsi="Nunito"/>
         </w:rPr>
         <w:t>Entwicklung einer responsiven und wartungsfreundlichen Website</w:t>
+      </w:r>
+    </w:p>
+    <w:p>
+      <w:pPr>
+        <w:numPr>
+          <w:ilvl w:val="0"/>
+          <w:numId w:val="14"/>
+        </w:numPr>
+        <w:spacing w:before="100" w:beforeAutospacing="1" w:after="100" w:afterAutospacing="1"/>
+        <w:rPr>
+          <w:rFonts w:ascii="Nunito" w:hAnsi="Nunito"/>
+        </w:rPr>
+      </w:pPr>
+      <w:r>
+        <w:rPr>
+          <w:rFonts w:ascii="Nunito" w:hAnsi="Nunito"/>
+        </w:rPr>
+        <w:t>Bilder- und Videogalerien erstellen/einplanen</w:t>
       </w:r>
     </w:p>
     <w:p>
@@ -2979,6 +2876,7 @@
         <w:rPr>
           <w:rFonts w:ascii="Nunito" w:hAnsi="Nunito"/>
         </w:rPr>
+        <w:lastRenderedPageBreak/>
         <w:t>Schnelle Ladezeiten (viele Besucher kommen über mobile Netze aus ländlichen Regionen)</w:t>
       </w:r>
     </w:p>
@@ -2987,7 +2885,6 @@
         <w:pStyle w:val="berschrift3"/>
       </w:pPr>
       <w:r>
-        <w:lastRenderedPageBreak/>
         <w:t xml:space="preserve">2.6 </w:t>
       </w:r>
       <w:r>
@@ -3334,6 +3231,7 @@
           <w:rFonts w:ascii="Nunito" w:hAnsi="Nunito"/>
           <w:color w:val="3D3D3D"/>
         </w:rPr>
+        <w:lastRenderedPageBreak/>
         <w:t xml:space="preserve">Das </w:t>
       </w:r>
       <w:proofErr w:type="spellStart"/>
@@ -3374,7 +3272,6 @@
         <w:pStyle w:val="berschrift3"/>
       </w:pPr>
       <w:r>
-        <w:lastRenderedPageBreak/>
         <w:t xml:space="preserve">2.7 </w:t>
       </w:r>
       <w:r>
@@ -3481,29 +3378,519 @@
     </w:p>
     <w:p>
       <w:pPr>
-        <w:rPr>
-          <w:rFonts w:ascii="Nunito" w:hAnsi="Nunito"/>
-        </w:rPr>
-      </w:pPr>
-      <w:r>
-        <w:rPr>
-          <w:rFonts w:ascii="Nunito" w:hAnsi="Nunito"/>
-        </w:rPr>
+        <w:pStyle w:val="berschrift3"/>
+        <w:shd w:val="clear" w:color="auto" w:fill="FFFFFF"/>
+        <w:spacing w:before="0" w:after="0" w:line="360" w:lineRule="atLeast"/>
+        <w:rPr>
+          <w:rFonts w:ascii="DM Sans" w:hAnsi="DM Sans"/>
+          <w:color w:val="18181A"/>
+          <w:sz w:val="24"/>
+          <w:szCs w:val="24"/>
+        </w:rPr>
+      </w:pPr>
+      <w:r>
         <w:t xml:space="preserve">Hosting: </w:t>
       </w:r>
       <w:proofErr w:type="spellStart"/>
       <w:r>
-        <w:rPr>
-          <w:rFonts w:ascii="Nunito" w:hAnsi="Nunito"/>
-        </w:rPr>
         <w:t>Hostinger</w:t>
       </w:r>
       <w:proofErr w:type="spellEnd"/>
       <w:r>
-        <w:rPr>
-          <w:rFonts w:ascii="Nunito" w:hAnsi="Nunito"/>
-        </w:rPr>
         <w:t xml:space="preserve"> Cloud Enterprise mit MCP für Claude</w:t>
+      </w:r>
+      <w:r>
+        <w:br/>
+      </w:r>
+      <w:r>
+        <w:br/>
+        <w:t>Für schnellen Launch:</w:t>
+      </w:r>
+      <w:r>
+        <w:br/>
+      </w:r>
+      <w:r>
+        <w:br/>
+      </w:r>
+      <w:r>
+        <w:rPr>
+          <w:rFonts w:ascii="DM Sans" w:hAnsi="DM Sans"/>
+          <w:color w:val="18181A"/>
+          <w:sz w:val="24"/>
+          <w:szCs w:val="24"/>
+        </w:rPr>
+        <w:t>Node.js-Details</w:t>
+      </w:r>
+    </w:p>
+    <w:p>
+      <w:pPr>
+        <w:shd w:val="clear" w:color="auto" w:fill="FFFFFF"/>
+        <w:rPr>
+          <w:rFonts w:ascii="DM Sans" w:hAnsi="DM Sans"/>
+          <w:color w:val="18181A"/>
+          <w:sz w:val="21"/>
+          <w:szCs w:val="21"/>
+        </w:rPr>
+      </w:pPr>
+      <w:r>
+        <w:rPr>
+          <w:rStyle w:val="h-typography"/>
+          <w:rFonts w:ascii="DM Sans" w:eastAsiaTheme="majorEastAsia" w:hAnsi="DM Sans"/>
+          <w:color w:val="58585E"/>
+          <w:sz w:val="21"/>
+          <w:szCs w:val="21"/>
+        </w:rPr>
+        <w:t>Unterstützte Frontend-</w:t>
+      </w:r>
+      <w:proofErr w:type="spellStart"/>
+      <w:r>
+        <w:rPr>
+          <w:rStyle w:val="h-typography"/>
+          <w:rFonts w:ascii="DM Sans" w:eastAsiaTheme="majorEastAsia" w:hAnsi="DM Sans"/>
+          <w:color w:val="58585E"/>
+          <w:sz w:val="21"/>
+          <w:szCs w:val="21"/>
+        </w:rPr>
+        <w:t>Frameworks</w:t>
+      </w:r>
+      <w:r>
+        <w:rPr>
+          <w:rStyle w:val="h-typography"/>
+          <w:rFonts w:ascii="DM Sans" w:eastAsiaTheme="majorEastAsia" w:hAnsi="DM Sans"/>
+          <w:color w:val="18181A"/>
+          <w:sz w:val="21"/>
+          <w:szCs w:val="21"/>
+        </w:rPr>
+        <w:t>Angular</w:t>
+      </w:r>
+      <w:proofErr w:type="spellEnd"/>
+      <w:r>
+        <w:rPr>
+          <w:rStyle w:val="h-typography"/>
+          <w:rFonts w:ascii="DM Sans" w:eastAsiaTheme="majorEastAsia" w:hAnsi="DM Sans"/>
+          <w:color w:val="18181A"/>
+          <w:sz w:val="21"/>
+          <w:szCs w:val="21"/>
+        </w:rPr>
+        <w:t xml:space="preserve">, </w:t>
+      </w:r>
+      <w:proofErr w:type="spellStart"/>
+      <w:r>
+        <w:rPr>
+          <w:rStyle w:val="h-typography"/>
+          <w:rFonts w:ascii="DM Sans" w:eastAsiaTheme="majorEastAsia" w:hAnsi="DM Sans"/>
+          <w:color w:val="18181A"/>
+          <w:sz w:val="21"/>
+          <w:szCs w:val="21"/>
+        </w:rPr>
+        <w:t>Astro</w:t>
+      </w:r>
+      <w:proofErr w:type="spellEnd"/>
+      <w:r>
+        <w:rPr>
+          <w:rStyle w:val="h-typography"/>
+          <w:rFonts w:ascii="DM Sans" w:eastAsiaTheme="majorEastAsia" w:hAnsi="DM Sans"/>
+          <w:color w:val="18181A"/>
+          <w:sz w:val="21"/>
+          <w:szCs w:val="21"/>
+        </w:rPr>
+        <w:t xml:space="preserve">, Next.js, </w:t>
+      </w:r>
+      <w:proofErr w:type="spellStart"/>
+      <w:r>
+        <w:rPr>
+          <w:rStyle w:val="h-typography"/>
+          <w:rFonts w:ascii="DM Sans" w:eastAsiaTheme="majorEastAsia" w:hAnsi="DM Sans"/>
+          <w:color w:val="18181A"/>
+          <w:sz w:val="21"/>
+          <w:szCs w:val="21"/>
+        </w:rPr>
+        <w:t>Nuxt</w:t>
+      </w:r>
+      <w:proofErr w:type="spellEnd"/>
+      <w:r>
+        <w:rPr>
+          <w:rStyle w:val="h-typography"/>
+          <w:rFonts w:ascii="DM Sans" w:eastAsiaTheme="majorEastAsia" w:hAnsi="DM Sans"/>
+          <w:color w:val="18181A"/>
+          <w:sz w:val="21"/>
+          <w:szCs w:val="21"/>
+        </w:rPr>
+        <w:t xml:space="preserve">, </w:t>
+      </w:r>
+      <w:proofErr w:type="spellStart"/>
+      <w:r>
+        <w:rPr>
+          <w:rStyle w:val="h-typography"/>
+          <w:rFonts w:ascii="DM Sans" w:eastAsiaTheme="majorEastAsia" w:hAnsi="DM Sans"/>
+          <w:color w:val="18181A"/>
+          <w:sz w:val="21"/>
+          <w:szCs w:val="21"/>
+        </w:rPr>
+        <w:t>Parcel</w:t>
+      </w:r>
+      <w:proofErr w:type="spellEnd"/>
+      <w:r>
+        <w:rPr>
+          <w:rStyle w:val="h-typography"/>
+          <w:rFonts w:ascii="DM Sans" w:eastAsiaTheme="majorEastAsia" w:hAnsi="DM Sans"/>
+          <w:color w:val="18181A"/>
+          <w:sz w:val="21"/>
+          <w:szCs w:val="21"/>
+        </w:rPr>
+        <w:t xml:space="preserve">, React, React Router, </w:t>
+      </w:r>
+      <w:proofErr w:type="spellStart"/>
+      <w:r>
+        <w:rPr>
+          <w:rStyle w:val="h-typography"/>
+          <w:rFonts w:ascii="DM Sans" w:eastAsiaTheme="majorEastAsia" w:hAnsi="DM Sans"/>
+          <w:color w:val="18181A"/>
+          <w:sz w:val="21"/>
+          <w:szCs w:val="21"/>
+        </w:rPr>
+        <w:t>Svelte</w:t>
+      </w:r>
+      <w:proofErr w:type="spellEnd"/>
+      <w:r>
+        <w:rPr>
+          <w:rStyle w:val="h-typography"/>
+          <w:rFonts w:ascii="DM Sans" w:eastAsiaTheme="majorEastAsia" w:hAnsi="DM Sans"/>
+          <w:color w:val="18181A"/>
+          <w:sz w:val="21"/>
+          <w:szCs w:val="21"/>
+        </w:rPr>
+        <w:t xml:space="preserve">, </w:t>
+      </w:r>
+      <w:proofErr w:type="spellStart"/>
+      <w:r>
+        <w:rPr>
+          <w:rStyle w:val="h-typography"/>
+          <w:rFonts w:ascii="DM Sans" w:eastAsiaTheme="majorEastAsia" w:hAnsi="DM Sans"/>
+          <w:color w:val="18181A"/>
+          <w:sz w:val="21"/>
+          <w:szCs w:val="21"/>
+        </w:rPr>
+        <w:t>SvelteKit</w:t>
+      </w:r>
+      <w:proofErr w:type="spellEnd"/>
+      <w:r>
+        <w:rPr>
+          <w:rStyle w:val="h-typography"/>
+          <w:rFonts w:ascii="DM Sans" w:eastAsiaTheme="majorEastAsia" w:hAnsi="DM Sans"/>
+          <w:color w:val="18181A"/>
+          <w:sz w:val="21"/>
+          <w:szCs w:val="21"/>
+        </w:rPr>
+        <w:t>, Vite, Vue.js</w:t>
+      </w:r>
+    </w:p>
+    <w:p>
+      <w:pPr>
+        <w:shd w:val="clear" w:color="auto" w:fill="FFFFFF"/>
+        <w:rPr>
+          <w:rFonts w:ascii="DM Sans" w:hAnsi="DM Sans"/>
+          <w:color w:val="18181A"/>
+          <w:sz w:val="21"/>
+          <w:szCs w:val="21"/>
+        </w:rPr>
+      </w:pPr>
+      <w:r>
+        <w:rPr>
+          <w:rStyle w:val="h-typography"/>
+          <w:rFonts w:ascii="DM Sans" w:eastAsiaTheme="majorEastAsia" w:hAnsi="DM Sans"/>
+          <w:color w:val="58585E"/>
+          <w:sz w:val="21"/>
+          <w:szCs w:val="21"/>
+        </w:rPr>
+        <w:t>Unterstützte Backend-</w:t>
+      </w:r>
+      <w:proofErr w:type="spellStart"/>
+      <w:r>
+        <w:rPr>
+          <w:rStyle w:val="h-typography"/>
+          <w:rFonts w:ascii="DM Sans" w:eastAsiaTheme="majorEastAsia" w:hAnsi="DM Sans"/>
+          <w:color w:val="58585E"/>
+          <w:sz w:val="21"/>
+          <w:szCs w:val="21"/>
+        </w:rPr>
+        <w:t>Frameworks</w:t>
+      </w:r>
+      <w:r>
+        <w:rPr>
+          <w:rStyle w:val="h-typography"/>
+          <w:rFonts w:ascii="DM Sans" w:eastAsiaTheme="majorEastAsia" w:hAnsi="DM Sans"/>
+          <w:color w:val="18181A"/>
+          <w:sz w:val="21"/>
+          <w:szCs w:val="21"/>
+        </w:rPr>
+        <w:t>Astro</w:t>
+      </w:r>
+      <w:proofErr w:type="spellEnd"/>
+      <w:r>
+        <w:rPr>
+          <w:rStyle w:val="h-typography"/>
+          <w:rFonts w:ascii="DM Sans" w:eastAsiaTheme="majorEastAsia" w:hAnsi="DM Sans"/>
+          <w:color w:val="18181A"/>
+          <w:sz w:val="21"/>
+          <w:szCs w:val="21"/>
+        </w:rPr>
+        <w:t xml:space="preserve">, Express, </w:t>
+      </w:r>
+      <w:proofErr w:type="spellStart"/>
+      <w:r>
+        <w:rPr>
+          <w:rStyle w:val="h-typography"/>
+          <w:rFonts w:ascii="DM Sans" w:eastAsiaTheme="majorEastAsia" w:hAnsi="DM Sans"/>
+          <w:color w:val="18181A"/>
+          <w:sz w:val="21"/>
+          <w:szCs w:val="21"/>
+        </w:rPr>
+        <w:t>Fastify</w:t>
+      </w:r>
+      <w:proofErr w:type="spellEnd"/>
+      <w:r>
+        <w:rPr>
+          <w:rStyle w:val="h-typography"/>
+          <w:rFonts w:ascii="DM Sans" w:eastAsiaTheme="majorEastAsia" w:hAnsi="DM Sans"/>
+          <w:color w:val="18181A"/>
+          <w:sz w:val="21"/>
+          <w:szCs w:val="21"/>
+        </w:rPr>
+        <w:t xml:space="preserve">, </w:t>
+      </w:r>
+      <w:proofErr w:type="spellStart"/>
+      <w:r>
+        <w:rPr>
+          <w:rStyle w:val="h-typography"/>
+          <w:rFonts w:ascii="DM Sans" w:eastAsiaTheme="majorEastAsia" w:hAnsi="DM Sans"/>
+          <w:color w:val="18181A"/>
+          <w:sz w:val="21"/>
+          <w:szCs w:val="21"/>
+        </w:rPr>
+        <w:t>Hono</w:t>
+      </w:r>
+      <w:proofErr w:type="spellEnd"/>
+      <w:r>
+        <w:rPr>
+          <w:rStyle w:val="h-typography"/>
+          <w:rFonts w:ascii="DM Sans" w:eastAsiaTheme="majorEastAsia" w:hAnsi="DM Sans"/>
+          <w:color w:val="18181A"/>
+          <w:sz w:val="21"/>
+          <w:szCs w:val="21"/>
+        </w:rPr>
+        <w:t xml:space="preserve">, </w:t>
+      </w:r>
+      <w:proofErr w:type="spellStart"/>
+      <w:r>
+        <w:rPr>
+          <w:rStyle w:val="h-typography"/>
+          <w:rFonts w:ascii="DM Sans" w:eastAsiaTheme="majorEastAsia" w:hAnsi="DM Sans"/>
+          <w:color w:val="18181A"/>
+          <w:sz w:val="21"/>
+          <w:szCs w:val="21"/>
+        </w:rPr>
+        <w:t>NestJS</w:t>
+      </w:r>
+      <w:proofErr w:type="spellEnd"/>
+      <w:r>
+        <w:rPr>
+          <w:rStyle w:val="h-typography"/>
+          <w:rFonts w:ascii="DM Sans" w:eastAsiaTheme="majorEastAsia" w:hAnsi="DM Sans"/>
+          <w:color w:val="18181A"/>
+          <w:sz w:val="21"/>
+          <w:szCs w:val="21"/>
+        </w:rPr>
+        <w:t xml:space="preserve">, Next.js, </w:t>
+      </w:r>
+      <w:proofErr w:type="spellStart"/>
+      <w:r>
+        <w:rPr>
+          <w:rStyle w:val="h-typography"/>
+          <w:rFonts w:ascii="DM Sans" w:eastAsiaTheme="majorEastAsia" w:hAnsi="DM Sans"/>
+          <w:color w:val="18181A"/>
+          <w:sz w:val="21"/>
+          <w:szCs w:val="21"/>
+        </w:rPr>
+        <w:t>Nuxt</w:t>
+      </w:r>
+      <w:proofErr w:type="spellEnd"/>
+      <w:r>
+        <w:rPr>
+          <w:rStyle w:val="h-typography"/>
+          <w:rFonts w:ascii="DM Sans" w:eastAsiaTheme="majorEastAsia" w:hAnsi="DM Sans"/>
+          <w:color w:val="18181A"/>
+          <w:sz w:val="21"/>
+          <w:szCs w:val="21"/>
+        </w:rPr>
+        <w:t xml:space="preserve">, React Router, </w:t>
+      </w:r>
+      <w:proofErr w:type="spellStart"/>
+      <w:r>
+        <w:rPr>
+          <w:rStyle w:val="h-typography"/>
+          <w:rFonts w:ascii="DM Sans" w:eastAsiaTheme="majorEastAsia" w:hAnsi="DM Sans"/>
+          <w:color w:val="18181A"/>
+          <w:sz w:val="21"/>
+          <w:szCs w:val="21"/>
+        </w:rPr>
+        <w:t>SvelteKit</w:t>
+      </w:r>
+      <w:proofErr w:type="spellEnd"/>
+    </w:p>
+    <w:p>
+      <w:pPr>
+        <w:shd w:val="clear" w:color="auto" w:fill="FFFFFF"/>
+        <w:rPr>
+          <w:rFonts w:ascii="DM Sans" w:hAnsi="DM Sans"/>
+          <w:color w:val="18181A"/>
+          <w:sz w:val="21"/>
+          <w:szCs w:val="21"/>
+        </w:rPr>
+      </w:pPr>
+      <w:r>
+        <w:rPr>
+          <w:rStyle w:val="h-typography"/>
+          <w:rFonts w:ascii="DM Sans" w:eastAsiaTheme="majorEastAsia" w:hAnsi="DM Sans"/>
+          <w:color w:val="58585E"/>
+          <w:sz w:val="21"/>
+          <w:szCs w:val="21"/>
+        </w:rPr>
+        <w:t>Unterstützte Node.js-Versionen</w:t>
+      </w:r>
+      <w:r>
+        <w:rPr>
+          <w:rStyle w:val="h-typography"/>
+          <w:rFonts w:ascii="DM Sans" w:eastAsiaTheme="majorEastAsia" w:hAnsi="DM Sans"/>
+          <w:color w:val="18181A"/>
+          <w:sz w:val="21"/>
+          <w:szCs w:val="21"/>
+        </w:rPr>
+        <w:t>24.x, 22.x, 20.x und 18.x</w:t>
+      </w:r>
+    </w:p>
+    <w:p>
+      <w:pPr>
+        <w:shd w:val="clear" w:color="auto" w:fill="FFFFFF"/>
+        <w:rPr>
+          <w:rFonts w:ascii="DM Sans" w:hAnsi="DM Sans"/>
+          <w:color w:val="18181A"/>
+          <w:sz w:val="21"/>
+          <w:szCs w:val="21"/>
+        </w:rPr>
+      </w:pPr>
+      <w:r>
+        <w:rPr>
+          <w:rStyle w:val="h-typography"/>
+          <w:rFonts w:ascii="DM Sans" w:eastAsiaTheme="majorEastAsia" w:hAnsi="DM Sans"/>
+          <w:color w:val="58585E"/>
+          <w:sz w:val="21"/>
+          <w:szCs w:val="21"/>
+        </w:rPr>
+        <w:t xml:space="preserve">Unterstützte </w:t>
+      </w:r>
+      <w:proofErr w:type="spellStart"/>
+      <w:r>
+        <w:rPr>
+          <w:rStyle w:val="h-typography"/>
+          <w:rFonts w:ascii="DM Sans" w:eastAsiaTheme="majorEastAsia" w:hAnsi="DM Sans"/>
+          <w:color w:val="58585E"/>
+          <w:sz w:val="21"/>
+          <w:szCs w:val="21"/>
+        </w:rPr>
+        <w:t>Paketmanager</w:t>
+      </w:r>
+      <w:r>
+        <w:rPr>
+          <w:rStyle w:val="h-typography"/>
+          <w:rFonts w:ascii="DM Sans" w:eastAsiaTheme="majorEastAsia" w:hAnsi="DM Sans"/>
+          <w:color w:val="18181A"/>
+          <w:sz w:val="21"/>
+          <w:szCs w:val="21"/>
+        </w:rPr>
+        <w:t>npm</w:t>
+      </w:r>
+      <w:proofErr w:type="spellEnd"/>
+      <w:r>
+        <w:rPr>
+          <w:rStyle w:val="h-typography"/>
+          <w:rFonts w:ascii="DM Sans" w:eastAsiaTheme="majorEastAsia" w:hAnsi="DM Sans"/>
+          <w:color w:val="18181A"/>
+          <w:sz w:val="21"/>
+          <w:szCs w:val="21"/>
+        </w:rPr>
+        <w:t xml:space="preserve"> (Standard), </w:t>
+      </w:r>
+      <w:proofErr w:type="spellStart"/>
+      <w:r>
+        <w:rPr>
+          <w:rStyle w:val="h-typography"/>
+          <w:rFonts w:ascii="DM Sans" w:eastAsiaTheme="majorEastAsia" w:hAnsi="DM Sans"/>
+          <w:color w:val="18181A"/>
+          <w:sz w:val="21"/>
+          <w:szCs w:val="21"/>
+        </w:rPr>
+        <w:t>yarn</w:t>
+      </w:r>
+      <w:proofErr w:type="spellEnd"/>
+      <w:r>
+        <w:rPr>
+          <w:rStyle w:val="h-typography"/>
+          <w:rFonts w:ascii="DM Sans" w:eastAsiaTheme="majorEastAsia" w:hAnsi="DM Sans"/>
+          <w:color w:val="18181A"/>
+          <w:sz w:val="21"/>
+          <w:szCs w:val="21"/>
+        </w:rPr>
+        <w:t xml:space="preserve"> und </w:t>
+      </w:r>
+      <w:proofErr w:type="spellStart"/>
+      <w:r>
+        <w:rPr>
+          <w:rStyle w:val="h-typography"/>
+          <w:rFonts w:ascii="DM Sans" w:eastAsiaTheme="majorEastAsia" w:hAnsi="DM Sans"/>
+          <w:color w:val="18181A"/>
+          <w:sz w:val="21"/>
+          <w:szCs w:val="21"/>
+        </w:rPr>
+        <w:t>pnpm</w:t>
+      </w:r>
+      <w:proofErr w:type="spellEnd"/>
+    </w:p>
+    <w:p>
+      <w:pPr>
+        <w:rPr>
+          <w:rFonts w:ascii="Nunito" w:hAnsi="Nunito"/>
+        </w:rPr>
+      </w:pPr>
+      <w:r>
+        <w:rPr>
+          <w:rFonts w:ascii="Nunito" w:hAnsi="Nunito"/>
+        </w:rPr>
+        <w:br/>
+      </w:r>
+      <w:r>
+        <w:rPr>
+          <w:rFonts w:ascii="Nunito" w:hAnsi="Nunito"/>
+        </w:rPr>
+        <w:br/>
+      </w:r>
+      <w:r>
+        <w:rPr>
+          <w:rStyle w:val="berschrift3Zchn"/>
+        </w:rPr>
+        <w:t>Bei steigender Komplexität:</w:t>
+      </w:r>
+      <w:r>
+        <w:rPr>
+          <w:rFonts w:ascii="Nunito" w:hAnsi="Nunito"/>
+        </w:rPr>
+        <w:t xml:space="preserve"> </w:t>
+      </w:r>
+      <w:r>
+        <w:rPr>
+          <w:rFonts w:ascii="Nunito" w:hAnsi="Nunito"/>
+        </w:rPr>
+        <w:br/>
       </w:r>
       <w:r>
         <w:rPr>
@@ -3722,25 +4109,6 @@
     <w:p>
       <w:pPr>
         <w:pStyle w:val="berschrift1"/>
-      </w:pPr>
-    </w:p>
-    <w:p>
-      <w:pPr>
-        <w:spacing w:after="160" w:line="278" w:lineRule="auto"/>
-        <w:rPr>
-          <w:rFonts w:asciiTheme="majorHAnsi" w:eastAsiaTheme="majorEastAsia" w:hAnsiTheme="majorHAnsi" w:cstheme="majorBidi"/>
-          <w:color w:val="0F4761" w:themeColor="accent1" w:themeShade="BF"/>
-          <w:sz w:val="40"/>
-          <w:szCs w:val="40"/>
-        </w:rPr>
-      </w:pPr>
-      <w:r>
-        <w:br w:type="page"/>
-      </w:r>
-    </w:p>
-    <w:p>
-      <w:pPr>
-        <w:pStyle w:val="berschrift1"/>
         <w:numPr>
           <w:ilvl w:val="0"/>
           <w:numId w:val="21"/>
@@ -3791,7 +4159,25 @@
             <w:sz w:val="24"/>
             <w:szCs w:val="24"/>
           </w:rPr>
-          <w:t>https://www.instagram.com/mavka.berlin.volunteers/</w:t>
+          <w:t>https://www.instag</w:t>
+        </w:r>
+        <w:r>
+          <w:rPr>
+            <w:rStyle w:val="Hyperlink"/>
+            <w:rFonts w:ascii="Nunito" w:eastAsia="Times New Roman" w:hAnsi="Nunito"/>
+            <w:sz w:val="24"/>
+            <w:szCs w:val="24"/>
+          </w:rPr>
+          <w:t>r</w:t>
+        </w:r>
+        <w:r>
+          <w:rPr>
+            <w:rStyle w:val="Hyperlink"/>
+            <w:rFonts w:ascii="Nunito" w:eastAsia="Times New Roman" w:hAnsi="Nunito"/>
+            <w:sz w:val="24"/>
+            <w:szCs w:val="24"/>
+          </w:rPr>
+          <w:t>am.com/mavka.berlin.volunteers/</w:t>
         </w:r>
       </w:hyperlink>
       <w:r>
@@ -3860,7 +4246,15 @@
           <w:rFonts w:ascii="Nunito" w:eastAsiaTheme="majorEastAsia" w:hAnsi="Nunito"/>
           <w:color w:val="1F1F1F"/>
         </w:rPr>
-        <w:t>Link zu den Workshops:</w:t>
+        <w:t>Link zu den Workshops</w:t>
+      </w:r>
+      <w:r>
+        <w:rPr>
+          <w:rStyle w:val="Fett"/>
+          <w:rFonts w:ascii="Nunito" w:eastAsiaTheme="majorEastAsia" w:hAnsi="Nunito"/>
+          <w:color w:val="1F1F1F"/>
+        </w:rPr>
+        <w:t xml:space="preserve"> + derzeitige Anmeldung mit Formular</w:t>
       </w:r>
     </w:p>
     <w:p>
@@ -3880,21 +4274,7 @@
             <w:rStyle w:val="Hyperlink"/>
             <w:rFonts w:ascii="Nunito" w:eastAsiaTheme="majorEastAsia" w:hAnsi="Nunito"/>
           </w:rPr>
-          <w:t>https://docs.google.com/forms/d/e/1FAIpQLSfvNGZxd0Qu_VyJ0igdK4KCga3fXCpY_YI7jD1r_1UnYJDE2g/viewform?fbclid=PAZXh0bgN</w:t>
-        </w:r>
-        <w:r>
-          <w:rPr>
-            <w:rStyle w:val="Hyperlink"/>
-            <w:rFonts w:ascii="Nunito" w:eastAsiaTheme="majorEastAsia" w:hAnsi="Nunito"/>
-          </w:rPr>
-          <w:t>h</w:t>
-        </w:r>
-        <w:r>
-          <w:rPr>
-            <w:rStyle w:val="Hyperlink"/>
-            <w:rFonts w:ascii="Nunito" w:eastAsiaTheme="majorEastAsia" w:hAnsi="Nunito"/>
-          </w:rPr>
-          <w:t>ZW0CMTEAc3J0YwZhcHBfaWQMMjU2MjgxMDQwNTU4AAGnVSrgwUB45VPiRRRFdb7BhwxHM3h5ir4zHFa_OMEX9js4g0FCTiFVjNcVjXY_aem_Ti0wnyNEqfjC9fS0PygTQw</w:t>
+          <w:t>https://docs.google.com/forms/d/e/1FAIpQLSfvNGZxd0Qu_VyJ0igdK4KCga3fXCpY_YI7jD1r_1UnYJDE2g/viewform?fbclid=PAZXh0bgNhZW0CMTEAc3J0YwZhcHBfaWQMMjU2MjgxMDQwNTU4AAGnVSrgwUB45VPiRRRFdb7BhwxHM3h5ir4zHFa_OMEX9js4g0FCTiFVjNcVjXY_aem_Ti0wnyNEqfjC9fS0PygTQw</w:t>
         </w:r>
       </w:hyperlink>
     </w:p>
@@ -4654,7 +5034,7 @@
           <w:szCs w:val="27"/>
         </w:rPr>
         <w:drawing>
-          <wp:inline distT="0" distB="0" distL="0" distR="0" wp14:anchorId="483DE883" wp14:editId="7FE708BD">
+          <wp:inline distT="0" distB="0" distL="0" distR="0" wp14:anchorId="483DE883" wp14:editId="57C5F13F">
             <wp:extent cx="5760720" cy="3826510"/>
             <wp:effectExtent l="0" t="0" r="5080" b="0"/>
             <wp:docPr id="126241941" name="Grafik 3" descr="Ein Bild, das Essen, Teller, Snack, Geschirr enthält.&#10;&#10;KI-generierte Inhalte können fehlerhaft sein."/>
@@ -4985,7 +5365,7 @@
           <w:szCs w:val="27"/>
         </w:rPr>
         <w:drawing>
-          <wp:inline distT="0" distB="0" distL="0" distR="0" wp14:anchorId="4BC77360" wp14:editId="42061F2E">
+          <wp:inline distT="0" distB="0" distL="0" distR="0" wp14:anchorId="4BC77360" wp14:editId="2104FF61">
             <wp:extent cx="5760720" cy="3842385"/>
             <wp:effectExtent l="0" t="0" r="5080" b="5715"/>
             <wp:docPr id="366851046" name="Grafik 1" descr="Ein Bild, das Fastfood, Snack, Essen, Junkfood enthält.&#10;&#10;KI-generierte Inhalte können fehlerhaft sein."/>
@@ -5118,37 +5498,6 @@
         </w:rPr>
         <w:t>Sonstiges:</w:t>
       </w:r>
-    </w:p>
-    <w:p>
-      <w:pPr>
-        <w:shd w:val="clear" w:color="auto" w:fill="FFFFFF"/>
-        <w:spacing w:line="360" w:lineRule="atLeast"/>
-        <w:rPr>
-          <w:rFonts w:ascii="Nunito" w:hAnsi="Nunito"/>
-          <w:color w:val="1F1F1F"/>
-          <w:spacing w:val="3"/>
-        </w:rPr>
-      </w:pPr>
-    </w:p>
-    <w:p>
-      <w:pPr>
-        <w:shd w:val="clear" w:color="auto" w:fill="FFFFFF"/>
-        <w:spacing w:line="300" w:lineRule="atLeast"/>
-        <w:rPr>
-          <w:rFonts w:ascii="Nunito" w:hAnsi="Nunito"/>
-          <w:color w:val="1F1F1F"/>
-          <w:sz w:val="22"/>
-          <w:szCs w:val="22"/>
-        </w:rPr>
-      </w:pPr>
-    </w:p>
-    <w:p>
-      <w:pPr>
-        <w:spacing w:before="100" w:beforeAutospacing="1" w:after="100" w:afterAutospacing="1"/>
-        <w:rPr>
-          <w:rFonts w:ascii="Nunito" w:hAnsi="Nunito"/>
-        </w:rPr>
-      </w:pPr>
     </w:p>
     <w:p>
       <w:pPr>
@@ -8558,6 +8907,7 @@
   <w:style w:type="character" w:default="1" w:styleId="Absatz-Standardschriftart">
     <w:name w:val="Default Paragraph Font"/>
     <w:uiPriority w:val="1"/>
+    <w:semiHidden/>
     <w:unhideWhenUsed/>
   </w:style>
   <w:style w:type="table" w:default="1" w:styleId="NormaleTabelle">
@@ -9158,6 +9508,11 @@
       <w:szCs w:val="22"/>
     </w:rPr>
   </w:style>
+  <w:style w:type="character" w:customStyle="1" w:styleId="h-typography">
+    <w:name w:val="h-typography"/>
+    <w:basedOn w:val="Absatz-Standardschriftart"/>
+    <w:rsid w:val="006C74ED"/>
+  </w:style>
 </w:styles>
 </file>
 

</xml_diff>